<commit_message>
Add a checked Sources and go deeper block to every room, sheet, and card.
Each room keeps a sources.json from links opened in 2026-10. Pages that did not open stay marked confirm, with a replacement only when that URL returned 200.

Co-authored-by: CYPHER0X9 <cipher0x9@users.noreply.github.com>
</commit_message>
<xml_diff>
--- a/downloads/templates/bridges.docx
+++ b/downloads/templates/bridges.docx
@@ -32,6 +32,46 @@
         <w:t>Independent free learning-only student project. Not affiliated. Contact https://cyphermonkeylabs.com/#contact. Nothing sold. CypherMonkey Labs. © 2026 CypherMonkeyLabs.</w:t>
       </w:r>
     </w:p>
+    <w:p>
+      <w:r>
+        <w:t>Sources and go deeper</w:t>
+      </w:r>
+    </w:p>
+    <w:p>
+      <w:r>
+        <w:t>Plan Direct Routing — learn — https://learn.microsoft.com/en-us/microsoftteams/direct-routing-plan — last checked 2026-10</w:t>
+      </w:r>
+    </w:p>
+    <w:p>
+      <w:r>
+        <w:t>Teams contact center integration models — learn — https://learn.microsoft.com/en-us/microsoftteams/teams-contact-center — last checked 2026-10</w:t>
+      </w:r>
+    </w:p>
+    <w:p>
+      <w:r>
+        <w:t>Cisco Unified Border Element — vendor — https://www.cisco.com/c/en/us/products/unified-communications/unified-border-element/index.html — last checked 2026-10</w:t>
+      </w:r>
+    </w:p>
+    <w:p>
+      <w:r>
+        <w:t>RFC 3261 — rfc — https://www.rfc-editor.org/rfc/rfc3261 — last checked 2026-10</w:t>
+      </w:r>
+    </w:p>
+    <w:p>
+      <w:r>
+        <w:t>Session border controller — wikipedia — https://en.wikipedia.org/wiki/Session_border_controller — last checked 2026-10</w:t>
+      </w:r>
+    </w:p>
+    <w:p>
+      <w:r>
+        <w:t>Session Initiation Protocol — wikipedia — https://en.wikipedia.org/wiki/Session_Initiation_Protocol — last checked 2026-10</w:t>
+      </w:r>
+    </w:p>
+    <w:p>
+      <w:r>
+        <w:t>Microsoft Teams blog index — community — https://techcommunity.microsoft.com/category/microsoftteams/blog/microsoftteamsblog — last checked 2026-10</w:t>
+      </w:r>
+    </w:p>
   </w:body>
 </w:document>
 </file>
</xml_diff>

<commit_message>
Add CRM, comparison, and routing chapters with a cited sources block on every page.
Co-authored-by: CYPHER0X9 <cipher0x9@users.noreply.github.com>
</commit_message>
<xml_diff>
--- a/downloads/templates/bridges.docx
+++ b/downloads/templates/bridges.docx
@@ -59,17 +59,17 @@
     </w:p>
     <w:p>
       <w:r>
-        <w:t>Session border controller — wikipedia — https://en.wikipedia.org/wiki/Session_border_controller — last checked 2026-10</w:t>
+        <w:t>Session border controller — wikipedia — https://en.wikipedia.org/wiki/Session_border_controller — last checked 2026-10. Wikipedia fallback for background. Confirm the vendor page before you change a tenant</w:t>
       </w:r>
     </w:p>
     <w:p>
       <w:r>
-        <w:t>Session Initiation Protocol — wikipedia — https://en.wikipedia.org/wiki/Session_Initiation_Protocol — last checked 2026-10</w:t>
+        <w:t>Session Initiation Protocol — wikipedia — https://en.wikipedia.org/wiki/Session_Initiation_Protocol — last checked 2026-10. Wikipedia fallback for background. Confirm the vendor page before you change a tenant</w:t>
       </w:r>
     </w:p>
     <w:p>
       <w:r>
-        <w:t>Microsoft Teams blog index — community — https://techcommunity.microsoft.com/category/microsoftteams/blog/microsoftteamsblog — last checked 2026-10</w:t>
+        <w:t>Microsoft Teams blog index — community — https://techcommunity.microsoft.com/category/microsoftteams/blog/microsoftteamsblog — last checked 2026-10. Community index for the Microsoft Teams blog. This is the index, not a claim that a post discusses this room</w:t>
       </w:r>
     </w:p>
   </w:body>

</xml_diff>

<commit_message>
Add cited CRM, comparison, and routing chapters (#9)
* Add CRM, comparison, and routing chapters with a cited sources block on every page.

Co-authored-by: CYPHER0X9 <cipher0x9@users.noreply.github.com>

* Fix track links, sheet images, missing menu targets, fonts, and the phone guide.

Co-authored-by: CYPHER0X9 <cipher0x9@users.noreply.github.com>

* Generate the missing track sheet PNGs for t01 through t16.

Co-authored-by: CYPHER0X9 <cipher0x9@users.noreply.github.com>

---------

Co-authored-by: Cursor Agent <cursoragent@cursor.com>
Co-authored-by: CYPHER0X9 <cipher0x9@users.noreply.github.com>
</commit_message>
<xml_diff>
--- a/downloads/templates/bridges.docx
+++ b/downloads/templates/bridges.docx
@@ -59,17 +59,17 @@
     </w:p>
     <w:p>
       <w:r>
-        <w:t>Session border controller — wikipedia — https://en.wikipedia.org/wiki/Session_border_controller — last checked 2026-10</w:t>
+        <w:t>Session border controller — wikipedia — https://en.wikipedia.org/wiki/Session_border_controller — last checked 2026-10. Wikipedia fallback for background. Confirm the vendor page before you change a tenant</w:t>
       </w:r>
     </w:p>
     <w:p>
       <w:r>
-        <w:t>Session Initiation Protocol — wikipedia — https://en.wikipedia.org/wiki/Session_Initiation_Protocol — last checked 2026-10</w:t>
+        <w:t>Session Initiation Protocol — wikipedia — https://en.wikipedia.org/wiki/Session_Initiation_Protocol — last checked 2026-10. Wikipedia fallback for background. Confirm the vendor page before you change a tenant</w:t>
       </w:r>
     </w:p>
     <w:p>
       <w:r>
-        <w:t>Microsoft Teams blog index — community — https://techcommunity.microsoft.com/category/microsoftteams/blog/microsoftteamsblog — last checked 2026-10</w:t>
+        <w:t>Microsoft Teams blog index — community — https://techcommunity.microsoft.com/category/microsoftteams/blog/microsoftteamsblog — last checked 2026-10. Community index for the Microsoft Teams blog. This is the index, not a claim that a post discusses this room</w:t>
       </w:r>
     </w:p>
   </w:body>

</xml_diff>